<commit_message>
Price offer: add Motul exclusive-agent lockup to the letterhead
Co-Authored-By: Claude Fable 5.1 <noreply@anthropic.com>
</commit_message>
<xml_diff>
--- a/profile/Diken-Price-Offer-Template.docx
+++ b/profile/Diken-Price-Offer-Template.docx
@@ -3160,8 +3160,9 @@
     </w:tblPr>
     <w:tblGrid>
       <w:gridCol w:w="1100"/>
-      <w:gridCol w:w="5800"/>
-      <w:gridCol w:w="3192"/>
+      <w:gridCol w:w="4300"/>
+      <w:gridCol w:w="2200"/>
+      <w:gridCol w:w="2492"/>
     </w:tblGrid>
     <w:tr>
       <w:tc>
@@ -3231,7 +3232,7 @@
       </w:tc>
       <w:tc>
         <w:tcPr>
-          <w:tcW w:type="dxa" w:w="5800"/>
+          <w:tcW w:type="dxa" w:w="4300"/>
           <w:tcBorders>
             <w:top w:val="none" w:color="FFFFFF" w:sz="0"/>
             <w:left w:val="none" w:color="FFFFFF" w:sz="0"/>
@@ -3285,7 +3286,90 @@
       </w:tc>
       <w:tc>
         <w:tcPr>
-          <w:tcW w:type="dxa" w:w="3192"/>
+          <w:tcW w:type="dxa" w:w="2200"/>
+          <w:tcBorders>
+            <w:top w:val="none" w:color="FFFFFF" w:sz="0"/>
+            <w:left w:val="none" w:color="FFFFFF" w:sz="0"/>
+            <w:bottom w:val="none" w:color="FFFFFF" w:sz="0"/>
+            <w:right w:val="none" w:color="FFFFFF" w:sz="0"/>
+          </w:tcBorders>
+          <w:shd w:fill="0B0B0C" w:color="auto" w:val="clear"/>
+          <w:tcMar>
+            <w:top w:type="dxa" w:w="100"/>
+            <w:left w:type="dxa" w:w="120"/>
+            <w:bottom w:type="dxa" w:w="100"/>
+            <w:right w:type="dxa" w:w="120"/>
+          </w:tcMar>
+          <w:vAlign w:val="center"/>
+        </w:tcPr>
+        <w:p>
+          <w:pPr>
+            <w:spacing w:after="60" w:before="0" w:line="276"/>
+            <w:jc w:val="left"/>
+          </w:pPr>
+          <w:r>
+            <w:rPr>
+              <w:rFonts w:ascii="Arial" w:cs="Arial" w:eastAsia="Arial" w:hAnsi="Arial"/>
+              <w:b/>
+              <w:bCs/>
+              <w:color w:val="B8BABD"/>
+              <w:spacing w:val="40"/>
+              <w:sz w:val="13"/>
+              <w:szCs w:val="13"/>
+            </w:rPr>
+            <w:t xml:space="preserve">EXCLUSIVE AGENT FOR JORDAN</w:t>
+          </w:r>
+        </w:p>
+        <w:p>
+          <w:pPr>
+            <w:spacing w:after="0" w:before="0" w:line="276"/>
+            <w:jc w:val="left"/>
+          </w:pPr>
+          <w:r>
+            <w:drawing>
+              <wp:inline distT="0" distB="0" distL="0" distR="0">
+                <wp:extent cx="876300" cy="238125"/>
+                <wp:effectExtent t="0" r="0" b="0" l="0"/>
+                <wp:docPr id="1" name="" descr="" title=""/>
+                <wp:cNvGraphicFramePr>
+                  <a:graphicFrameLocks xmlns:a="http://schemas.openxmlformats.org/drawingml/2006/main" noChangeAspect="1"/>
+                </wp:cNvGraphicFramePr>
+                <a:graphic xmlns:a="http://schemas.openxmlformats.org/drawingml/2006/main">
+                  <a:graphicData uri="http://schemas.openxmlformats.org/drawingml/2006/picture">
+                    <pic:pic xmlns:pic="http://schemas.openxmlformats.org/drawingml/2006/picture">
+                      <pic:nvPicPr>
+                        <pic:cNvPr id="0" name="" descr=""/>
+                        <pic:cNvPicPr>
+                          <a:picLocks noChangeAspect="1" noChangeArrowheads="1"/>
+                        </pic:cNvPicPr>
+                      </pic:nvPicPr>
+                      <pic:blipFill>
+                        <a:blip r:embed="rId1" cstate="none"/>
+                        <a:srcRect/>
+                        <a:stretch>
+                          <a:fillRect/>
+                        </a:stretch>
+                      </pic:blipFill>
+                      <pic:spPr bwMode="auto">
+                        <a:xfrm>
+                          <a:off x="0" y="0"/>
+                          <a:ext cx="876300" cy="238125"/>
+                        </a:xfrm>
+                        <a:prstGeom prst="rect">
+                          <a:avLst/>
+                        </a:prstGeom>
+                      </pic:spPr>
+                    </pic:pic>
+                  </a:graphicData>
+                </a:graphic>
+              </wp:inline>
+            </w:drawing>
+          </w:r>
+        </w:p>
+      </w:tc>
+      <w:tc>
+        <w:tcPr>
+          <w:tcW w:type="dxa" w:w="2492"/>
           <w:tcBorders>
             <w:top w:val="none" w:color="FFFFFF" w:sz="0"/>
             <w:left w:val="none" w:color="FFFFFF" w:sz="0"/>

</xml_diff>

<commit_message>
Price offer: blank labeled template for the team, payment as agreed by contract
Co-Authored-By: Claude Fable 5.1 <noreply@anthropic.com>
</commit_message>
<xml_diff>
--- a/profile/Diken-Price-Offer-Template.docx
+++ b/profile/Diken-Price-Offer-Template.docx
@@ -87,7 +87,7 @@
                 <w:szCs w:val="16"/>
                 <w:shd w:fill="D4141D" w:color="auto" w:val="clear"/>
               </w:rPr>
-              <w:t xml:space="preserve">  [DIVISION]  </w:t>
+              <w:t xml:space="preserve">  Distribution &amp; Agencies  </w:t>
             </w:r>
           </w:p>
         </w:tc>
@@ -574,7 +574,7 @@
                 <w:sz w:val="18"/>
                 <w:szCs w:val="18"/>
               </w:rPr>
-              <w:t xml:space="preserve">Diken Bros Co., [Division]</w:t>
+              <w:t xml:space="preserve">Diken Bros Co., Distribution &amp; Agencies</w:t>
             </w:r>
           </w:p>
           <w:p>
@@ -639,7 +639,7 @@
           <w:sz w:val="20"/>
           <w:szCs w:val="20"/>
         </w:rPr>
-        <w:t xml:space="preserve">[One sentence on what is offered, for whom, and where it is delivered.]</w:t>
+        <w:t xml:space="preserve">Supply of Motul lubricants for [client / fleet / site]. Prices are for genuine Motul products supplied by Diken Bros as exclusive agent for Jordan, delivered to [delivery address].</w:t>
       </w:r>
     </w:p>
     <w:tbl>
@@ -957,7 +957,7 @@
                 <w:sz w:val="18"/>
                 <w:szCs w:val="18"/>
               </w:rPr>
-              <w:t xml:space="preserve">[Item description]</w:t>
+              <w:t xml:space="preserve">[Product, grade and pack size]</w:t>
             </w:r>
           </w:p>
           <w:p>
@@ -974,7 +974,7 @@
                 <w:sz w:val="15"/>
                 <w:szCs w:val="15"/>
               </w:rPr>
-              <w:t xml:space="preserve">[Part number, pack size, specification]</w:t>
+              <w:t xml:space="preserve">[Motul part number]</w:t>
             </w:r>
           </w:p>
         </w:tc>
@@ -1044,7 +1044,7 @@
                 <w:sz w:val="18"/>
                 <w:szCs w:val="18"/>
               </w:rPr>
-              <w:t xml:space="preserve">[unit]</w:t>
+              <w:t xml:space="preserve">case</w:t>
             </w:r>
           </w:p>
         </w:tc>
@@ -1188,24 +1188,7 @@
                 <w:sz w:val="18"/>
                 <w:szCs w:val="18"/>
               </w:rPr>
-              <w:t xml:space="preserve">[Item description]</w:t>
-            </w:r>
-          </w:p>
-          <w:p>
-            <w:pPr>
-              <w:spacing w:after="0" w:before="20" w:line="276"/>
-              <w:jc w:val="left"/>
-            </w:pPr>
-            <w:r>
-              <w:rPr>
-                <w:rFonts w:ascii="Arial" w:cs="Arial" w:eastAsia="Arial" w:hAnsi="Arial"/>
-                <w:b w:val="false"/>
-                <w:bCs w:val="false"/>
-                <w:color w:val="6B6E73"/>
-                <w:sz w:val="15"/>
-                <w:szCs w:val="15"/>
-              </w:rPr>
-              <w:t xml:space="preserve">[Detail]</w:t>
+              <w:t xml:space="preserve"/>
             </w:r>
           </w:p>
         </w:tc>
@@ -1241,7 +1224,7 @@
                 <w:sz w:val="18"/>
                 <w:szCs w:val="18"/>
               </w:rPr>
-              <w:t xml:space="preserve">0</w:t>
+              <w:t xml:space="preserve"/>
             </w:r>
           </w:p>
         </w:tc>
@@ -1277,7 +1260,7 @@
                 <w:sz w:val="18"/>
                 <w:szCs w:val="18"/>
               </w:rPr>
-              <w:t xml:space="preserve">[unit]</w:t>
+              <w:t xml:space="preserve"/>
             </w:r>
           </w:p>
         </w:tc>
@@ -1313,7 +1296,7 @@
                 <w:sz w:val="18"/>
                 <w:szCs w:val="18"/>
               </w:rPr>
-              <w:t xml:space="preserve">0.00</w:t>
+              <w:t xml:space="preserve"/>
             </w:r>
           </w:p>
         </w:tc>
@@ -1349,7 +1332,7 @@
                 <w:sz w:val="18"/>
                 <w:szCs w:val="18"/>
               </w:rPr>
-              <w:t xml:space="preserve">0.00</w:t>
+              <w:t xml:space="preserve"/>
             </w:r>
           </w:p>
         </w:tc>
@@ -1421,24 +1404,7 @@
                 <w:sz w:val="18"/>
                 <w:szCs w:val="18"/>
               </w:rPr>
-              <w:t xml:space="preserve">[Item description]</w:t>
-            </w:r>
-          </w:p>
-          <w:p>
-            <w:pPr>
-              <w:spacing w:after="0" w:before="20" w:line="276"/>
-              <w:jc w:val="left"/>
-            </w:pPr>
-            <w:r>
-              <w:rPr>
-                <w:rFonts w:ascii="Arial" w:cs="Arial" w:eastAsia="Arial" w:hAnsi="Arial"/>
-                <w:b w:val="false"/>
-                <w:bCs w:val="false"/>
-                <w:color w:val="6B6E73"/>
-                <w:sz w:val="15"/>
-                <w:szCs w:val="15"/>
-              </w:rPr>
-              <w:t xml:space="preserve">[Detail]</w:t>
+              <w:t xml:space="preserve"/>
             </w:r>
           </w:p>
         </w:tc>
@@ -1473,7 +1439,7 @@
                 <w:sz w:val="18"/>
                 <w:szCs w:val="18"/>
               </w:rPr>
-              <w:t xml:space="preserve">0</w:t>
+              <w:t xml:space="preserve"/>
             </w:r>
           </w:p>
         </w:tc>
@@ -1508,7 +1474,7 @@
                 <w:sz w:val="18"/>
                 <w:szCs w:val="18"/>
               </w:rPr>
-              <w:t xml:space="preserve">[unit]</w:t>
+              <w:t xml:space="preserve"/>
             </w:r>
           </w:p>
         </w:tc>
@@ -1543,7 +1509,7 @@
                 <w:sz w:val="18"/>
                 <w:szCs w:val="18"/>
               </w:rPr>
-              <w:t xml:space="preserve">0.00</w:t>
+              <w:t xml:space="preserve"/>
             </w:r>
           </w:p>
         </w:tc>
@@ -1578,7 +1544,7 @@
                 <w:sz w:val="18"/>
                 <w:szCs w:val="18"/>
               </w:rPr>
-              <w:t xml:space="preserve">0.00</w:t>
+              <w:t xml:space="preserve"/>
             </w:r>
           </w:p>
         </w:tc>
@@ -1652,24 +1618,7 @@
                 <w:sz w:val="18"/>
                 <w:szCs w:val="18"/>
               </w:rPr>
-              <w:t xml:space="preserve">[Delivery / installation / service line, if any]</w:t>
-            </w:r>
-          </w:p>
-          <w:p>
-            <w:pPr>
-              <w:spacing w:after="0" w:before="20" w:line="276"/>
-              <w:jc w:val="left"/>
-            </w:pPr>
-            <w:r>
-              <w:rPr>
-                <w:rFonts w:ascii="Arial" w:cs="Arial" w:eastAsia="Arial" w:hAnsi="Arial"/>
-                <w:b w:val="false"/>
-                <w:bCs w:val="false"/>
-                <w:color w:val="6B6E73"/>
-                <w:sz w:val="15"/>
-                <w:szCs w:val="15"/>
-              </w:rPr>
-              <w:t xml:space="preserve">[Detail]</w:t>
+              <w:t xml:space="preserve"/>
             </w:r>
           </w:p>
         </w:tc>
@@ -1705,7 +1654,7 @@
                 <w:sz w:val="18"/>
                 <w:szCs w:val="18"/>
               </w:rPr>
-              <w:t xml:space="preserve">1</w:t>
+              <w:t xml:space="preserve"/>
             </w:r>
           </w:p>
         </w:tc>
@@ -1741,7 +1690,7 @@
                 <w:sz w:val="18"/>
                 <w:szCs w:val="18"/>
               </w:rPr>
-              <w:t xml:space="preserve">lot</w:t>
+              <w:t xml:space="preserve"/>
             </w:r>
           </w:p>
         </w:tc>
@@ -1777,7 +1726,7 @@
                 <w:sz w:val="18"/>
                 <w:szCs w:val="18"/>
               </w:rPr>
-              <w:t xml:space="preserve">0.00</w:t>
+              <w:t xml:space="preserve"/>
             </w:r>
           </w:p>
         </w:tc>
@@ -1813,7 +1762,437 @@
                 <w:sz w:val="18"/>
                 <w:szCs w:val="18"/>
               </w:rPr>
-              <w:t xml:space="preserve">0.00</w:t>
+              <w:t xml:space="preserve"/>
+            </w:r>
+          </w:p>
+        </w:tc>
+      </w:tr>
+      <w:tr>
+        <w:tc>
+          <w:tcPr>
+            <w:tcW w:type="dxa" w:w="500"/>
+            <w:tcBorders>
+              <w:top w:val="none" w:color="FFFFFF" w:sz="0"/>
+              <w:left w:val="none" w:color="FFFFFF" w:sz="0"/>
+              <w:bottom w:val="single" w:color="E3E5E8" w:sz="4"/>
+              <w:right w:val="none" w:color="FFFFFF" w:sz="0"/>
+            </w:tcBorders>
+            <w:tcMar>
+              <w:top w:type="dxa" w:w="110"/>
+              <w:left w:type="dxa" w:w="120"/>
+              <w:bottom w:type="dxa" w:w="110"/>
+              <w:right w:type="dxa" w:w="120"/>
+            </w:tcMar>
+            <w:vAlign w:val="top"/>
+          </w:tcPr>
+          <w:p>
+            <w:pPr>
+              <w:spacing w:after="0" w:before="0" w:line="276"/>
+              <w:jc w:val="left"/>
+            </w:pPr>
+            <w:r>
+              <w:rPr>
+                <w:rFonts w:ascii="Arial" w:cs="Arial" w:eastAsia="Arial" w:hAnsi="Arial"/>
+                <w:b w:val="false"/>
+                <w:bCs w:val="false"/>
+                <w:color w:val="111214"/>
+                <w:sz w:val="18"/>
+                <w:szCs w:val="18"/>
+              </w:rPr>
+              <w:t xml:space="preserve">5</w:t>
+            </w:r>
+          </w:p>
+        </w:tc>
+        <w:tc>
+          <w:tcPr>
+            <w:tcW w:type="dxa" w:w="4592"/>
+            <w:tcBorders>
+              <w:top w:val="none" w:color="FFFFFF" w:sz="0"/>
+              <w:left w:val="none" w:color="FFFFFF" w:sz="0"/>
+              <w:bottom w:val="single" w:color="E3E5E8" w:sz="4"/>
+              <w:right w:val="none" w:color="FFFFFF" w:sz="0"/>
+            </w:tcBorders>
+            <w:tcMar>
+              <w:top w:type="dxa" w:w="110"/>
+              <w:left w:type="dxa" w:w="120"/>
+              <w:bottom w:type="dxa" w:w="110"/>
+              <w:right w:type="dxa" w:w="120"/>
+            </w:tcMar>
+            <w:vAlign w:val="top"/>
+          </w:tcPr>
+          <w:p>
+            <w:pPr>
+              <w:spacing w:after="0" w:before="0" w:line="276"/>
+              <w:jc w:val="left"/>
+            </w:pPr>
+            <w:r>
+              <w:rPr>
+                <w:rFonts w:ascii="Arial" w:cs="Arial" w:eastAsia="Arial" w:hAnsi="Arial"/>
+                <w:b w:val="false"/>
+                <w:bCs w:val="false"/>
+                <w:color w:val="111214"/>
+                <w:sz w:val="18"/>
+                <w:szCs w:val="18"/>
+              </w:rPr>
+              <w:t xml:space="preserve"/>
+            </w:r>
+          </w:p>
+        </w:tc>
+        <w:tc>
+          <w:tcPr>
+            <w:tcW w:type="dxa" w:w="1000"/>
+            <w:tcBorders>
+              <w:top w:val="none" w:color="FFFFFF" w:sz="0"/>
+              <w:left w:val="none" w:color="FFFFFF" w:sz="0"/>
+              <w:bottom w:val="single" w:color="E3E5E8" w:sz="4"/>
+              <w:right w:val="none" w:color="FFFFFF" w:sz="0"/>
+            </w:tcBorders>
+            <w:tcMar>
+              <w:top w:type="dxa" w:w="110"/>
+              <w:left w:type="dxa" w:w="120"/>
+              <w:bottom w:type="dxa" w:w="110"/>
+              <w:right w:type="dxa" w:w="120"/>
+            </w:tcMar>
+            <w:vAlign w:val="top"/>
+          </w:tcPr>
+          <w:p>
+            <w:pPr>
+              <w:spacing w:after="0" w:before="0" w:line="276"/>
+              <w:jc w:val="right"/>
+            </w:pPr>
+            <w:r>
+              <w:rPr>
+                <w:rFonts w:ascii="Arial" w:cs="Arial" w:eastAsia="Arial" w:hAnsi="Arial"/>
+                <w:b w:val="false"/>
+                <w:bCs w:val="false"/>
+                <w:color w:val="111214"/>
+                <w:sz w:val="18"/>
+                <w:szCs w:val="18"/>
+              </w:rPr>
+              <w:t xml:space="preserve"/>
+            </w:r>
+          </w:p>
+        </w:tc>
+        <w:tc>
+          <w:tcPr>
+            <w:tcW w:type="dxa" w:w="900"/>
+            <w:tcBorders>
+              <w:top w:val="none" w:color="FFFFFF" w:sz="0"/>
+              <w:left w:val="none" w:color="FFFFFF" w:sz="0"/>
+              <w:bottom w:val="single" w:color="E3E5E8" w:sz="4"/>
+              <w:right w:val="none" w:color="FFFFFF" w:sz="0"/>
+            </w:tcBorders>
+            <w:tcMar>
+              <w:top w:type="dxa" w:w="110"/>
+              <w:left w:type="dxa" w:w="120"/>
+              <w:bottom w:type="dxa" w:w="110"/>
+              <w:right w:type="dxa" w:w="120"/>
+            </w:tcMar>
+            <w:vAlign w:val="top"/>
+          </w:tcPr>
+          <w:p>
+            <w:pPr>
+              <w:spacing w:after="0" w:before="0" w:line="276"/>
+              <w:jc w:val="left"/>
+            </w:pPr>
+            <w:r>
+              <w:rPr>
+                <w:rFonts w:ascii="Arial" w:cs="Arial" w:eastAsia="Arial" w:hAnsi="Arial"/>
+                <w:b w:val="false"/>
+                <w:bCs w:val="false"/>
+                <w:color w:val="111214"/>
+                <w:sz w:val="18"/>
+                <w:szCs w:val="18"/>
+              </w:rPr>
+              <w:t xml:space="preserve"/>
+            </w:r>
+          </w:p>
+        </w:tc>
+        <w:tc>
+          <w:tcPr>
+            <w:tcW w:type="dxa" w:w="1500"/>
+            <w:tcBorders>
+              <w:top w:val="none" w:color="FFFFFF" w:sz="0"/>
+              <w:left w:val="none" w:color="FFFFFF" w:sz="0"/>
+              <w:bottom w:val="single" w:color="E3E5E8" w:sz="4"/>
+              <w:right w:val="none" w:color="FFFFFF" w:sz="0"/>
+            </w:tcBorders>
+            <w:tcMar>
+              <w:top w:type="dxa" w:w="110"/>
+              <w:left w:type="dxa" w:w="120"/>
+              <w:bottom w:type="dxa" w:w="110"/>
+              <w:right w:type="dxa" w:w="120"/>
+            </w:tcMar>
+            <w:vAlign w:val="top"/>
+          </w:tcPr>
+          <w:p>
+            <w:pPr>
+              <w:spacing w:after="0" w:before="0" w:line="276"/>
+              <w:jc w:val="right"/>
+            </w:pPr>
+            <w:r>
+              <w:rPr>
+                <w:rFonts w:ascii="Arial" w:cs="Arial" w:eastAsia="Arial" w:hAnsi="Arial"/>
+                <w:b w:val="false"/>
+                <w:bCs w:val="false"/>
+                <w:color w:val="111214"/>
+                <w:sz w:val="18"/>
+                <w:szCs w:val="18"/>
+              </w:rPr>
+              <w:t xml:space="preserve"/>
+            </w:r>
+          </w:p>
+        </w:tc>
+        <w:tc>
+          <w:tcPr>
+            <w:tcW w:type="dxa" w:w="1600"/>
+            <w:tcBorders>
+              <w:top w:val="none" w:color="FFFFFF" w:sz="0"/>
+              <w:left w:val="none" w:color="FFFFFF" w:sz="0"/>
+              <w:bottom w:val="single" w:color="E3E5E8" w:sz="4"/>
+              <w:right w:val="none" w:color="FFFFFF" w:sz="0"/>
+            </w:tcBorders>
+            <w:tcMar>
+              <w:top w:type="dxa" w:w="110"/>
+              <w:left w:type="dxa" w:w="120"/>
+              <w:bottom w:type="dxa" w:w="110"/>
+              <w:right w:type="dxa" w:w="120"/>
+            </w:tcMar>
+            <w:vAlign w:val="top"/>
+          </w:tcPr>
+          <w:p>
+            <w:pPr>
+              <w:spacing w:after="0" w:before="0" w:line="276"/>
+              <w:jc w:val="right"/>
+            </w:pPr>
+            <w:r>
+              <w:rPr>
+                <w:rFonts w:ascii="Arial" w:cs="Arial" w:eastAsia="Arial" w:hAnsi="Arial"/>
+                <w:b w:val="false"/>
+                <w:bCs w:val="false"/>
+                <w:color w:val="111214"/>
+                <w:sz w:val="18"/>
+                <w:szCs w:val="18"/>
+              </w:rPr>
+              <w:t xml:space="preserve"/>
+            </w:r>
+          </w:p>
+        </w:tc>
+      </w:tr>
+      <w:tr>
+        <w:tc>
+          <w:tcPr>
+            <w:tcW w:type="dxa" w:w="500"/>
+            <w:tcBorders>
+              <w:top w:val="none" w:color="FFFFFF" w:sz="0"/>
+              <w:left w:val="none" w:color="FFFFFF" w:sz="0"/>
+              <w:bottom w:val="single" w:color="E3E5E8" w:sz="4"/>
+              <w:right w:val="none" w:color="FFFFFF" w:sz="0"/>
+            </w:tcBorders>
+            <w:shd w:fill="FAFAFA" w:color="auto" w:val="clear"/>
+            <w:tcMar>
+              <w:top w:type="dxa" w:w="110"/>
+              <w:left w:type="dxa" w:w="120"/>
+              <w:bottom w:type="dxa" w:w="110"/>
+              <w:right w:type="dxa" w:w="120"/>
+            </w:tcMar>
+            <w:vAlign w:val="top"/>
+          </w:tcPr>
+          <w:p>
+            <w:pPr>
+              <w:spacing w:after="0" w:before="0" w:line="276"/>
+              <w:jc w:val="left"/>
+            </w:pPr>
+            <w:r>
+              <w:rPr>
+                <w:rFonts w:ascii="Arial" w:cs="Arial" w:eastAsia="Arial" w:hAnsi="Arial"/>
+                <w:b w:val="false"/>
+                <w:bCs w:val="false"/>
+                <w:color w:val="111214"/>
+                <w:sz w:val="18"/>
+                <w:szCs w:val="18"/>
+              </w:rPr>
+              <w:t xml:space="preserve">6</w:t>
+            </w:r>
+          </w:p>
+        </w:tc>
+        <w:tc>
+          <w:tcPr>
+            <w:tcW w:type="dxa" w:w="4592"/>
+            <w:tcBorders>
+              <w:top w:val="none" w:color="FFFFFF" w:sz="0"/>
+              <w:left w:val="none" w:color="FFFFFF" w:sz="0"/>
+              <w:bottom w:val="single" w:color="E3E5E8" w:sz="4"/>
+              <w:right w:val="none" w:color="FFFFFF" w:sz="0"/>
+            </w:tcBorders>
+            <w:shd w:fill="FAFAFA" w:color="auto" w:val="clear"/>
+            <w:tcMar>
+              <w:top w:type="dxa" w:w="110"/>
+              <w:left w:type="dxa" w:w="120"/>
+              <w:bottom w:type="dxa" w:w="110"/>
+              <w:right w:type="dxa" w:w="120"/>
+            </w:tcMar>
+            <w:vAlign w:val="top"/>
+          </w:tcPr>
+          <w:p>
+            <w:pPr>
+              <w:spacing w:after="0" w:before="0" w:line="276"/>
+              <w:jc w:val="left"/>
+            </w:pPr>
+            <w:r>
+              <w:rPr>
+                <w:rFonts w:ascii="Arial" w:cs="Arial" w:eastAsia="Arial" w:hAnsi="Arial"/>
+                <w:b w:val="false"/>
+                <w:bCs w:val="false"/>
+                <w:color w:val="111214"/>
+                <w:sz w:val="18"/>
+                <w:szCs w:val="18"/>
+              </w:rPr>
+              <w:t xml:space="preserve"/>
+            </w:r>
+          </w:p>
+        </w:tc>
+        <w:tc>
+          <w:tcPr>
+            <w:tcW w:type="dxa" w:w="1000"/>
+            <w:tcBorders>
+              <w:top w:val="none" w:color="FFFFFF" w:sz="0"/>
+              <w:left w:val="none" w:color="FFFFFF" w:sz="0"/>
+              <w:bottom w:val="single" w:color="E3E5E8" w:sz="4"/>
+              <w:right w:val="none" w:color="FFFFFF" w:sz="0"/>
+            </w:tcBorders>
+            <w:shd w:fill="FAFAFA" w:color="auto" w:val="clear"/>
+            <w:tcMar>
+              <w:top w:type="dxa" w:w="110"/>
+              <w:left w:type="dxa" w:w="120"/>
+              <w:bottom w:type="dxa" w:w="110"/>
+              <w:right w:type="dxa" w:w="120"/>
+            </w:tcMar>
+            <w:vAlign w:val="top"/>
+          </w:tcPr>
+          <w:p>
+            <w:pPr>
+              <w:spacing w:after="0" w:before="0" w:line="276"/>
+              <w:jc w:val="right"/>
+            </w:pPr>
+            <w:r>
+              <w:rPr>
+                <w:rFonts w:ascii="Arial" w:cs="Arial" w:eastAsia="Arial" w:hAnsi="Arial"/>
+                <w:b w:val="false"/>
+                <w:bCs w:val="false"/>
+                <w:color w:val="111214"/>
+                <w:sz w:val="18"/>
+                <w:szCs w:val="18"/>
+              </w:rPr>
+              <w:t xml:space="preserve"/>
+            </w:r>
+          </w:p>
+        </w:tc>
+        <w:tc>
+          <w:tcPr>
+            <w:tcW w:type="dxa" w:w="900"/>
+            <w:tcBorders>
+              <w:top w:val="none" w:color="FFFFFF" w:sz="0"/>
+              <w:left w:val="none" w:color="FFFFFF" w:sz="0"/>
+              <w:bottom w:val="single" w:color="E3E5E8" w:sz="4"/>
+              <w:right w:val="none" w:color="FFFFFF" w:sz="0"/>
+            </w:tcBorders>
+            <w:shd w:fill="FAFAFA" w:color="auto" w:val="clear"/>
+            <w:tcMar>
+              <w:top w:type="dxa" w:w="110"/>
+              <w:left w:type="dxa" w:w="120"/>
+              <w:bottom w:type="dxa" w:w="110"/>
+              <w:right w:type="dxa" w:w="120"/>
+            </w:tcMar>
+            <w:vAlign w:val="top"/>
+          </w:tcPr>
+          <w:p>
+            <w:pPr>
+              <w:spacing w:after="0" w:before="0" w:line="276"/>
+              <w:jc w:val="left"/>
+            </w:pPr>
+            <w:r>
+              <w:rPr>
+                <w:rFonts w:ascii="Arial" w:cs="Arial" w:eastAsia="Arial" w:hAnsi="Arial"/>
+                <w:b w:val="false"/>
+                <w:bCs w:val="false"/>
+                <w:color w:val="111214"/>
+                <w:sz w:val="18"/>
+                <w:szCs w:val="18"/>
+              </w:rPr>
+              <w:t xml:space="preserve"/>
+            </w:r>
+          </w:p>
+        </w:tc>
+        <w:tc>
+          <w:tcPr>
+            <w:tcW w:type="dxa" w:w="1500"/>
+            <w:tcBorders>
+              <w:top w:val="none" w:color="FFFFFF" w:sz="0"/>
+              <w:left w:val="none" w:color="FFFFFF" w:sz="0"/>
+              <w:bottom w:val="single" w:color="E3E5E8" w:sz="4"/>
+              <w:right w:val="none" w:color="FFFFFF" w:sz="0"/>
+            </w:tcBorders>
+            <w:shd w:fill="FAFAFA" w:color="auto" w:val="clear"/>
+            <w:tcMar>
+              <w:top w:type="dxa" w:w="110"/>
+              <w:left w:type="dxa" w:w="120"/>
+              <w:bottom w:type="dxa" w:w="110"/>
+              <w:right w:type="dxa" w:w="120"/>
+            </w:tcMar>
+            <w:vAlign w:val="top"/>
+          </w:tcPr>
+          <w:p>
+            <w:pPr>
+              <w:spacing w:after="0" w:before="0" w:line="276"/>
+              <w:jc w:val="right"/>
+            </w:pPr>
+            <w:r>
+              <w:rPr>
+                <w:rFonts w:ascii="Arial" w:cs="Arial" w:eastAsia="Arial" w:hAnsi="Arial"/>
+                <w:b w:val="false"/>
+                <w:bCs w:val="false"/>
+                <w:color w:val="111214"/>
+                <w:sz w:val="18"/>
+                <w:szCs w:val="18"/>
+              </w:rPr>
+              <w:t xml:space="preserve"/>
+            </w:r>
+          </w:p>
+        </w:tc>
+        <w:tc>
+          <w:tcPr>
+            <w:tcW w:type="dxa" w:w="1600"/>
+            <w:tcBorders>
+              <w:top w:val="none" w:color="FFFFFF" w:sz="0"/>
+              <w:left w:val="none" w:color="FFFFFF" w:sz="0"/>
+              <w:bottom w:val="single" w:color="E3E5E8" w:sz="4"/>
+              <w:right w:val="none" w:color="FFFFFF" w:sz="0"/>
+            </w:tcBorders>
+            <w:shd w:fill="FAFAFA" w:color="auto" w:val="clear"/>
+            <w:tcMar>
+              <w:top w:type="dxa" w:w="110"/>
+              <w:left w:type="dxa" w:w="120"/>
+              <w:bottom w:type="dxa" w:w="110"/>
+              <w:right w:type="dxa" w:w="120"/>
+            </w:tcMar>
+            <w:vAlign w:val="top"/>
+          </w:tcPr>
+          <w:p>
+            <w:pPr>
+              <w:spacing w:after="0" w:before="0" w:line="276"/>
+              <w:jc w:val="right"/>
+            </w:pPr>
+            <w:r>
+              <w:rPr>
+                <w:rFonts w:ascii="Arial" w:cs="Arial" w:eastAsia="Arial" w:hAnsi="Arial"/>
+                <w:b w:val="false"/>
+                <w:bCs w:val="false"/>
+                <w:color w:val="111214"/>
+                <w:sz w:val="18"/>
+                <w:szCs w:val="18"/>
+              </w:rPr>
+              <w:t xml:space="preserve"/>
             </w:r>
           </w:p>
         </w:tc>
@@ -1958,7 +2337,7 @@
                 <w:sz w:val="18"/>
                 <w:szCs w:val="18"/>
               </w:rPr>
-              <w:t xml:space="preserve">Discount</w:t>
+              <w:t xml:space="preserve">Discount, __%</w:t>
             </w:r>
           </w:p>
         </w:tc>
@@ -2302,7 +2681,7 @@
                 <w:sz w:val="17"/>
                 <w:szCs w:val="17"/>
               </w:rPr>
-              <w:t xml:space="preserve">30 days from the date of this offer. Prices are subject to the manufacturer's price list at the time of order confirmation.</w:t>
+              <w:t xml:space="preserve">30 days from the date of this offer. Prices are subject to Motul's price list at the time of order confirmation.</w:t>
             </w:r>
           </w:p>
         </w:tc>
@@ -2390,7 +2769,7 @@
                 <w:sz w:val="17"/>
                 <w:szCs w:val="17"/>
               </w:rPr>
-              <w:t xml:space="preserve">50% with the purchase order, 50% on delivery. Bank transfer to Diken Bros Co., account details on the invoice.</w:t>
+              <w:t xml:space="preserve">As agreed by contract.</w:t>
             </w:r>
           </w:p>
         </w:tc>
@@ -2533,7 +2912,7 @@
                 <w:sz w:val="17"/>
                 <w:szCs w:val="17"/>
               </w:rPr>
-              <w:t xml:space="preserve">Genuine products with manufacturer warranty. Unopened, undamaged goods returnable within 14 days.</w:t>
+              <w:t xml:space="preserve">Genuine Motul products with manufacturer warranty. Unopened, undamaged cases returnable within 14 days.</w:t>
             </w:r>
           </w:p>
         </w:tc>

</xml_diff>